<commit_message>
Agente NFE Cenários de Teste
</commit_message>
<xml_diff>
--- a/Desafio 2 - Projeto - 11062025/Versões Relatório/Grupo_01_Proposta_de_Projeto v4.docx
+++ b/Desafio 2 - Projeto - 11062025/Versões Relatório/Grupo_01_Proposta_de_Projeto v4.docx
@@ -9937,7 +9937,31 @@
         <w:rPr>
           <w:rFonts w:ascii="Arial" w:eastAsia="Arial" w:hAnsi="Arial" w:cs="Arial"/>
         </w:rPr>
-        <w:t xml:space="preserve"> Aceita uma pergunta do usuário, um arquivo de documento fiscal (CSV, PDF ou imagem) e a conexão com o banco de dados.</w:t>
+        <w:t xml:space="preserve"> Aceita uma pergunta do usuário, um arquivo de documento fiscal (CSV, PDF</w:t>
+      </w:r>
+      <w:r>
+        <w:rPr>
+          <w:rFonts w:ascii="Arial" w:eastAsia="Arial" w:hAnsi="Arial" w:cs="Arial"/>
+        </w:rPr>
+        <w:t>,</w:t>
+      </w:r>
+      <w:r>
+        <w:rPr>
+          <w:rFonts w:ascii="Arial" w:eastAsia="Arial" w:hAnsi="Arial" w:cs="Arial"/>
+        </w:rPr>
+        <w:t xml:space="preserve"> imagem</w:t>
+      </w:r>
+      <w:r>
+        <w:rPr>
+          <w:rFonts w:ascii="Arial" w:eastAsia="Arial" w:hAnsi="Arial" w:cs="Arial"/>
+        </w:rPr>
+        <w:t xml:space="preserve"> PNG ou XML</w:t>
+      </w:r>
+      <w:r>
+        <w:rPr>
+          <w:rFonts w:ascii="Arial" w:eastAsia="Arial" w:hAnsi="Arial" w:cs="Arial"/>
+        </w:rPr>
+        <w:t>) e a conexão com o banco de dados.</w:t>
       </w:r>
     </w:p>
     <w:p>
@@ -11007,7 +11031,35 @@
           <w:rFonts w:ascii="Arial" w:eastAsia="Arial" w:hAnsi="Arial" w:cs="Arial"/>
           <w:color w:val="000000"/>
         </w:rPr>
-        <w:t xml:space="preserve"> Aceita requisições do usuário, que incluem uma pergunta, um arquivo de documento fiscal (em formato CSV, PDF ou imagem) e a conexão com o banco de dados.</w:t>
+        <w:t xml:space="preserve"> Aceita requisições do usuário, que incluem uma pergunta, um arquivo de documento fiscal (em formato CSV, PDF</w:t>
+      </w:r>
+      <w:r>
+        <w:rPr>
+          <w:rFonts w:ascii="Arial" w:eastAsia="Arial" w:hAnsi="Arial" w:cs="Arial"/>
+          <w:color w:val="000000"/>
+        </w:rPr>
+        <w:t xml:space="preserve">, </w:t>
+      </w:r>
+      <w:r>
+        <w:rPr>
+          <w:rFonts w:ascii="Arial" w:eastAsia="Arial" w:hAnsi="Arial" w:cs="Arial"/>
+          <w:color w:val="000000"/>
+        </w:rPr>
+        <w:t>imagem</w:t>
+      </w:r>
+      <w:r>
+        <w:rPr>
+          <w:rFonts w:ascii="Arial" w:eastAsia="Arial" w:hAnsi="Arial" w:cs="Arial"/>
+          <w:color w:val="000000"/>
+        </w:rPr>
+        <w:t xml:space="preserve"> PNG ou XML</w:t>
+      </w:r>
+      <w:r>
+        <w:rPr>
+          <w:rFonts w:ascii="Arial" w:eastAsia="Arial" w:hAnsi="Arial" w:cs="Arial"/>
+          <w:color w:val="000000"/>
+        </w:rPr>
+        <w:t>) e a conexão com o banco de dados.</w:t>
       </w:r>
     </w:p>
     <w:p>
@@ -11752,7 +11804,23 @@
           <w:b/>
           <w:color w:val="000000"/>
         </w:rPr>
-        <w:t xml:space="preserve"> (CSV):</w:t>
+        <w:t xml:space="preserve"> (CSV</w:t>
+      </w:r>
+      <w:r>
+        <w:rPr>
+          <w:rFonts w:ascii="Arial" w:eastAsia="Arial" w:hAnsi="Arial" w:cs="Arial"/>
+          <w:b/>
+          <w:color w:val="000000"/>
+        </w:rPr>
+        <w:t>/XML</w:t>
+      </w:r>
+      <w:r>
+        <w:rPr>
+          <w:rFonts w:ascii="Arial" w:eastAsia="Arial" w:hAnsi="Arial" w:cs="Arial"/>
+          <w:b/>
+          <w:color w:val="000000"/>
+        </w:rPr>
+        <w:t>):</w:t>
       </w:r>
       <w:r>
         <w:rPr>
@@ -11774,7 +11842,21 @@
           <w:rFonts w:ascii="Arial" w:eastAsia="Arial" w:hAnsi="Arial" w:cs="Arial"/>
           <w:color w:val="000000"/>
         </w:rPr>
-        <w:t xml:space="preserve"> para PDF/Imagem, porém adaptado ao formato CSV, buscando a sigla do tipo, a versão, o modelo e o significado dos nomes dos campos.</w:t>
+        <w:t xml:space="preserve"> para PDF/Imagem, porém adaptado ao formato CSV</w:t>
+      </w:r>
+      <w:r>
+        <w:rPr>
+          <w:rFonts w:ascii="Arial" w:eastAsia="Arial" w:hAnsi="Arial" w:cs="Arial"/>
+          <w:color w:val="000000"/>
+        </w:rPr>
+        <w:t>/XML</w:t>
+      </w:r>
+      <w:r>
+        <w:rPr>
+          <w:rFonts w:ascii="Arial" w:eastAsia="Arial" w:hAnsi="Arial" w:cs="Arial"/>
+          <w:color w:val="000000"/>
+        </w:rPr>
+        <w:t>, buscando a sigla do tipo, a versão, o modelo e o significado dos nomes dos campos.</w:t>
       </w:r>
     </w:p>
     <w:p>
@@ -11961,7 +12043,7 @@
               </wp:inline>
             </w:drawing>
           </mc:Choice>
-          <mc:Fallback xmlns:sl="http://schemas.openxmlformats.org/schemaLibrary/2006/main" xmlns:a="http://schemas.openxmlformats.org/drawingml/2006/main" xmlns:pic="http://schemas.openxmlformats.org/drawingml/2006/picture" xmlns:c="http://schemas.openxmlformats.org/drawingml/2006/chart" xmlns:lc="http://schemas.openxmlformats.org/drawingml/2006/lockedCanvas" xmlns:dgm="http://schemas.openxmlformats.org/drawingml/2006/diagram" xmlns="http://schemas.microsoft.com/office/tasks/2019/documenttasks" xmlns:cr="http://schemas.microsoft.com/office/comments/2020/reactions">
+          <mc:Fallback xmlns:cr="http://schemas.microsoft.com/office/comments/2020/reactions" xmlns="http://schemas.microsoft.com/office/tasks/2019/documenttasks" xmlns:dgm="http://schemas.openxmlformats.org/drawingml/2006/diagram" xmlns:lc="http://schemas.openxmlformats.org/drawingml/2006/lockedCanvas" xmlns:c="http://schemas.openxmlformats.org/drawingml/2006/chart" xmlns:pic="http://schemas.openxmlformats.org/drawingml/2006/picture" xmlns:a="http://schemas.openxmlformats.org/drawingml/2006/main" xmlns:sl="http://schemas.openxmlformats.org/schemaLibrary/2006/main">
             <w:drawing>
               <wp:inline distB="114300" distT="114300" distL="114300" distR="114300">
                 <wp:extent cx="3657600" cy="4448175"/>

</xml_diff>